<commit_message>
Packaged into .jar file and made updates to word file.
</commit_message>
<xml_diff>
--- a/CardGame Documentation.docx
+++ b/CardGame Documentation.docx
@@ -9,7 +9,6 @@
           <w:b/>
           <w:bCs/>
           <w:u w:val="single"/>
-          <w:lang w:val="en-JE"/>
         </w:rPr>
       </w:pPr>
       <w:r>
@@ -17,7 +16,6 @@
           <w:b/>
           <w:bCs/>
           <w:u w:val="single"/>
-          <w:lang w:val="en-JE"/>
         </w:rPr>
         <w:t>Design Rationale</w:t>
       </w:r>
@@ -27,103 +25,39 @@
         <w:rPr>
           <w:b/>
           <w:bCs/>
-          <w:lang w:val="en-JE"/>
         </w:rPr>
       </w:pPr>
       <w:r>
         <w:rPr>
           <w:b/>
           <w:bCs/>
-          <w:lang w:val="en-JE"/>
         </w:rPr>
         <w:t>Key Architecture of Code</w:t>
       </w:r>
     </w:p>
     <w:p>
-      <w:pPr>
-        <w:rPr>
-          <w:lang w:val="en-JE"/>
-        </w:rPr>
-      </w:pPr>
-      <w:proofErr w:type="spellStart"/>
-      <w:r>
-        <w:rPr>
-          <w:lang w:val="en-JE"/>
-        </w:rPr>
-        <w:t>CardGame</w:t>
-      </w:r>
-      <w:proofErr w:type="spellEnd"/>
-      <w:r>
-        <w:rPr>
-          <w:lang w:val="en-JE"/>
-        </w:rPr>
-        <w:t xml:space="preserve"> is responsible for the main game logic and management. It parses the input data, validates the data, initializes the ring topology and manages the thread execution. Other classes do what they should do and nothing more. This keeps everything clear, secure and encapsulated.</w:t>
-      </w:r>
-    </w:p>
-    <w:p>
-      <w:pPr>
-        <w:rPr>
-          <w:lang w:val="en-JE"/>
-        </w:rPr>
-      </w:pPr>
-      <w:r>
-        <w:rPr>
-          <w:lang w:val="en-JE"/>
-        </w:rPr>
+      <w:r>
+        <w:t>CardGame is responsible for the main game logic and management. It parses the input data, validates the data, initializes the ring topology and manages the thread execution. Other classes do what they should do and nothing more. This keeps everything clear, secure and encapsulated.</w:t>
+      </w:r>
+    </w:p>
+    <w:p>
+      <w:r>
         <w:t>Player is the main work horse of the card game. It implements runnable and manages its own localized game loop. It interacts with shared resources like Deck and Hand.</w:t>
       </w:r>
     </w:p>
     <w:p>
-      <w:pPr>
-        <w:rPr>
-          <w:lang w:val="en-JE"/>
-        </w:rPr>
-      </w:pPr>
-      <w:r>
-        <w:rPr>
-          <w:lang w:val="en-JE"/>
-        </w:rPr>
+      <w:r>
         <w:t>Deck is a thread safe container for Card objects to be stored and allows access concurrently by Players.</w:t>
       </w:r>
     </w:p>
     <w:p>
-      <w:pPr>
-        <w:rPr>
-          <w:lang w:val="en-JE"/>
-        </w:rPr>
-      </w:pPr>
-      <w:r>
-        <w:rPr>
-          <w:lang w:val="en-JE"/>
-        </w:rPr>
+      <w:r>
         <w:t>Hand encapsulates the logic of holding a player's cards, verifying wins and selecting non preferred cards to discard.</w:t>
       </w:r>
     </w:p>
     <w:p>
-      <w:pPr>
-        <w:rPr>
-          <w:lang w:val="en-JE"/>
-        </w:rPr>
-      </w:pPr>
-      <w:r>
-        <w:rPr>
-          <w:lang w:val="en-JE"/>
-        </w:rPr>
-        <w:t xml:space="preserve">Card is immutable. It holds value and </w:t>
-      </w:r>
-      <w:proofErr w:type="spellStart"/>
-      <w:r>
-        <w:rPr>
-          <w:lang w:val="en-JE"/>
-        </w:rPr>
-        <w:t>cardId</w:t>
-      </w:r>
-      <w:proofErr w:type="spellEnd"/>
-      <w:r>
-        <w:rPr>
-          <w:lang w:val="en-JE"/>
-        </w:rPr>
-        <w:t xml:space="preserve"> preventing accidental change across threads.</w:t>
+      <w:r>
+        <w:t>Card is immutable. It holds value and cardId preventing accidental change across threads.</w:t>
       </w:r>
     </w:p>
     <w:p>
@@ -131,205 +65,41 @@
         <w:rPr>
           <w:b/>
           <w:bCs/>
-          <w:lang w:val="en-JE"/>
         </w:rPr>
       </w:pPr>
       <w:r>
         <w:rPr>
           <w:b/>
           <w:bCs/>
-          <w:lang w:val="en-JE"/>
         </w:rPr>
         <w:t>Concurrency Decisions and Thread Safety</w:t>
       </w:r>
     </w:p>
     <w:p>
-      <w:pPr>
-        <w:rPr>
-          <w:lang w:val="en-JE"/>
-        </w:rPr>
-      </w:pPr>
-      <w:r>
-        <w:rPr>
-          <w:lang w:val="en-JE"/>
-        </w:rPr>
+      <w:r>
         <w:t xml:space="preserve">The main challenge we faced during this specification was ensuring drawing a card from the left deck and discarding it to the right deck was on </w:t>
       </w:r>
       <w:r>
-        <w:rPr>
-          <w:lang w:val="en-JE"/>
-        </w:rPr>
         <w:t>singular</w:t>
       </w:r>
       <w:r>
-        <w:rPr>
-          <w:lang w:val="en-JE"/>
-        </w:rPr>
         <w:t xml:space="preserve"> atomic action.</w:t>
       </w:r>
     </w:p>
     <w:p>
-      <w:pPr>
-        <w:rPr>
-          <w:lang w:val="en-JE"/>
-        </w:rPr>
-      </w:pPr>
-      <w:r>
-        <w:rPr>
-          <w:lang w:val="en-JE"/>
-        </w:rPr>
-        <w:t xml:space="preserve">We started by using a </w:t>
-      </w:r>
-      <w:proofErr w:type="spellStart"/>
-      <w:r>
-        <w:rPr>
-          <w:lang w:val="en-JE"/>
-        </w:rPr>
-        <w:t>LinkedBlockingQueue</w:t>
-      </w:r>
-      <w:proofErr w:type="spellEnd"/>
-      <w:r>
-        <w:rPr>
-          <w:lang w:val="en-JE"/>
-        </w:rPr>
-        <w:t xml:space="preserve"> because it handles the thread safety using </w:t>
-      </w:r>
-      <w:proofErr w:type="gramStart"/>
-      <w:r>
-        <w:rPr>
-          <w:lang w:val="en-JE"/>
-        </w:rPr>
-        <w:t>put(</w:t>
-      </w:r>
-      <w:proofErr w:type="gramEnd"/>
-      <w:r>
-        <w:rPr>
-          <w:lang w:val="en-JE"/>
-        </w:rPr>
-        <w:t xml:space="preserve">) and </w:t>
-      </w:r>
-      <w:proofErr w:type="gramStart"/>
-      <w:r>
-        <w:rPr>
-          <w:lang w:val="en-JE"/>
-        </w:rPr>
-        <w:t>take(</w:t>
-      </w:r>
-      <w:proofErr w:type="gramEnd"/>
-      <w:r>
-        <w:rPr>
-          <w:lang w:val="en-JE"/>
-        </w:rPr>
-        <w:t xml:space="preserve">) easily. </w:t>
-      </w:r>
-      <w:proofErr w:type="gramStart"/>
-      <w:r>
-        <w:rPr>
-          <w:lang w:val="en-JE"/>
-        </w:rPr>
-        <w:t>However</w:t>
-      </w:r>
-      <w:proofErr w:type="gramEnd"/>
-      <w:r>
-        <w:rPr>
-          <w:lang w:val="en-JE"/>
-        </w:rPr>
-        <w:t xml:space="preserve"> this didn</w:t>
-      </w:r>
-      <w:r>
-        <w:rPr>
-          <w:lang w:val="en-JE"/>
-        </w:rPr>
+      <w:r>
+        <w:t>We started by using a LinkedBlockingQueue because it handles the thread safety using put() and take() easily. However this didn</w:t>
+      </w:r>
+      <w:r>
         <w:t>’</w:t>
       </w:r>
       <w:r>
-        <w:rPr>
-          <w:lang w:val="en-JE"/>
-        </w:rPr>
-        <w:t xml:space="preserve">t guarantee that draw and discard would happen together without issues. So </w:t>
-      </w:r>
-      <w:proofErr w:type="gramStart"/>
-      <w:r>
-        <w:rPr>
-          <w:lang w:val="en-JE"/>
-        </w:rPr>
-        <w:t>instead</w:t>
-      </w:r>
-      <w:proofErr w:type="gramEnd"/>
-      <w:r>
-        <w:rPr>
-          <w:lang w:val="en-JE"/>
-        </w:rPr>
-        <w:t xml:space="preserve"> we are using </w:t>
-      </w:r>
-      <w:proofErr w:type="spellStart"/>
-      <w:r>
-        <w:rPr>
-          <w:lang w:val="en-JE"/>
-        </w:rPr>
-        <w:t>ArrayDeque</w:t>
-      </w:r>
-      <w:proofErr w:type="spellEnd"/>
-      <w:r>
-        <w:rPr>
-          <w:lang w:val="en-JE"/>
-        </w:rPr>
-        <w:t xml:space="preserve"> and </w:t>
-      </w:r>
-      <w:proofErr w:type="spellStart"/>
-      <w:r>
-        <w:rPr>
-          <w:lang w:val="en-JE"/>
-        </w:rPr>
-        <w:t>ReentrantLock</w:t>
-      </w:r>
-      <w:proofErr w:type="spellEnd"/>
-      <w:r>
-        <w:rPr>
-          <w:lang w:val="en-JE"/>
-        </w:rPr>
-        <w:t xml:space="preserve">. This allows a Player thread to </w:t>
-      </w:r>
-      <w:proofErr w:type="spellStart"/>
-      <w:r>
-        <w:rPr>
-          <w:lang w:val="en-JE"/>
-        </w:rPr>
-        <w:t>aquire</w:t>
-      </w:r>
-      <w:proofErr w:type="spellEnd"/>
-      <w:r>
-        <w:rPr>
-          <w:lang w:val="en-JE"/>
-        </w:rPr>
-        <w:t xml:space="preserve"> access to their left and right decks at the same time before modifying either and ensuring atomic actions.</w:t>
-      </w:r>
-    </w:p>
-    <w:p>
-      <w:pPr>
-        <w:rPr>
-          <w:lang w:val="en-JE"/>
-        </w:rPr>
-      </w:pPr>
-      <w:r>
-        <w:rPr>
-          <w:lang w:val="en-JE"/>
-        </w:rPr>
-        <w:t xml:space="preserve">We also use </w:t>
-      </w:r>
-      <w:proofErr w:type="spellStart"/>
-      <w:r>
-        <w:rPr>
-          <w:lang w:val="en-JE"/>
-        </w:rPr>
-        <w:t>AtomicBoolean</w:t>
-      </w:r>
-      <w:proofErr w:type="spellEnd"/>
-      <w:r>
-        <w:rPr>
-          <w:lang w:val="en-JE"/>
-        </w:rPr>
-        <w:t xml:space="preserve"> across all threads. This ensures once one player thread wins, all other threads see this and can exit easily.</w:t>
+        <w:t>t guarantee that draw and discard would happen together without issues. So instead we are using ArrayDeque and ReentrantLock. This allows a Player thread to aquire access to their left and right decks at the same time before modifying either and ensuring atomic actions.</w:t>
+      </w:r>
+    </w:p>
+    <w:p>
+      <w:r>
+        <w:t>We also use AtomicBoolean across all threads. This ensures once one player thread wins, all other threads see this and can exit easily.</w:t>
       </w:r>
     </w:p>
     <w:p>
@@ -337,67 +107,29 @@
         <w:rPr>
           <w:b/>
           <w:bCs/>
-          <w:lang w:val="en-JE"/>
         </w:rPr>
       </w:pPr>
       <w:r>
         <w:rPr>
           <w:b/>
           <w:bCs/>
-          <w:lang w:val="en-JE"/>
         </w:rPr>
         <w:t>Object Orientated Design</w:t>
       </w:r>
     </w:p>
     <w:p>
-      <w:pPr>
-        <w:rPr>
-          <w:lang w:val="en-JE"/>
-        </w:rPr>
-      </w:pPr>
-      <w:r>
-        <w:rPr>
-          <w:lang w:val="en-JE"/>
-        </w:rPr>
+      <w:r>
         <w:t>To satisfy the requirement that a game must not stagnate, the Hand class uses Random to select from all non preferred cards.</w:t>
       </w:r>
     </w:p>
     <w:p>
-      <w:pPr>
-        <w:rPr>
-          <w:lang w:val="en-JE"/>
-        </w:rPr>
-      </w:pPr>
-      <w:r>
-        <w:rPr>
-          <w:lang w:val="en-JE"/>
-        </w:rPr>
+      <w:r>
         <w:t>Using encapsulation, we also created custom runtime exceptions to implement fail solutions and communicate them effectively.</w:t>
       </w:r>
     </w:p>
     <w:p>
-      <w:pPr>
-        <w:rPr>
-          <w:lang w:val="en-JE"/>
-        </w:rPr>
-      </w:pPr>
-      <w:r>
-        <w:rPr>
-          <w:lang w:val="en-JE"/>
-        </w:rPr>
-        <w:t xml:space="preserve">We have </w:t>
-      </w:r>
-      <w:r>
-        <w:rPr>
-          <w:lang w:val="en-JE"/>
-        </w:rPr>
-        <w:t>separated</w:t>
-      </w:r>
-      <w:r>
-        <w:rPr>
-          <w:lang w:val="en-JE"/>
-        </w:rPr>
-        <w:t xml:space="preserve"> the Hand and Deck classes as the Deck requires FIFO and a Hand requires random access.</w:t>
+      <w:r>
+        <w:t>We have separated the Hand and Deck classes as the Deck requires FIFO and a Hand requires random access.</w:t>
       </w:r>
     </w:p>
     <w:p>
@@ -405,67 +137,33 @@
         <w:rPr>
           <w:b/>
           <w:bCs/>
-          <w:lang w:val="en-JE"/>
         </w:rPr>
       </w:pPr>
       <w:r>
         <w:rPr>
           <w:b/>
           <w:bCs/>
-          <w:lang w:val="en-JE"/>
         </w:rPr>
         <w:t>Known Limitations</w:t>
       </w:r>
     </w:p>
     <w:p>
-      <w:pPr>
-        <w:rPr>
-          <w:lang w:val="en-JE"/>
-        </w:rPr>
-      </w:pPr>
-      <w:r>
-        <w:rPr>
-          <w:lang w:val="en-JE"/>
-        </w:rPr>
+      <w:r>
         <w:t>Because adjacent players share decks, which lock twice per turn, at a large game e.g. n = 10000, these locks may lead to bottleneck and performance could drop dramatically.</w:t>
       </w:r>
     </w:p>
     <w:p>
-      <w:pPr>
-        <w:rPr>
-          <w:lang w:val="en-JE"/>
-        </w:rPr>
-      </w:pPr>
       <w:r>
         <w:rPr>
           <w:b/>
           <w:bCs/>
-          <w:lang w:val="en-JE"/>
         </w:rPr>
         <w:t>Testing</w:t>
       </w:r>
     </w:p>
-    <w:p>
-      <w:pPr>
-        <w:rPr>
-          <w:lang w:val="en-JE"/>
-        </w:rPr>
-      </w:pPr>
-    </w:p>
-    <w:p>
-      <w:pPr>
-        <w:rPr>
-          <w:lang w:val="en-JE"/>
-        </w:rPr>
-      </w:pPr>
-    </w:p>
-    <w:p>
-      <w:pPr>
-        <w:rPr>
-          <w:lang w:val="en-JE"/>
-        </w:rPr>
-      </w:pPr>
-    </w:p>
+    <w:p/>
+    <w:p/>
+    <w:p/>
     <w:p>
       <w:pPr>
         <w:jc w:val="center"/>
@@ -473,7 +171,6 @@
           <w:b/>
           <w:bCs/>
           <w:u w:val="single"/>
-          <w:lang w:val="en-JE"/>
         </w:rPr>
       </w:pPr>
       <w:r>
@@ -481,7 +178,6 @@
           <w:b/>
           <w:bCs/>
           <w:u w:val="single"/>
-          <w:lang w:val="en-JE"/>
         </w:rPr>
         <w:lastRenderedPageBreak/>
         <w:t>Pair Programming</w:t>
@@ -506,15 +202,7 @@
             <w:tcW w:w="1785" w:type="dxa"/>
           </w:tcPr>
           <w:p>
-            <w:pPr>
-              <w:rPr>
-                <w:lang w:val="en-JE"/>
-              </w:rPr>
-            </w:pPr>
-            <w:r>
-              <w:rPr>
-                <w:lang w:val="en-JE"/>
-              </w:rPr>
+            <w:r>
               <w:t>Date</w:t>
             </w:r>
           </w:p>
@@ -524,15 +212,7 @@
             <w:tcW w:w="1790" w:type="dxa"/>
           </w:tcPr>
           <w:p>
-            <w:pPr>
-              <w:rPr>
-                <w:lang w:val="en-JE"/>
-              </w:rPr>
-            </w:pPr>
-            <w:r>
-              <w:rPr>
-                <w:lang w:val="en-JE"/>
-              </w:rPr>
+            <w:r>
               <w:t>Time</w:t>
             </w:r>
           </w:p>
@@ -542,15 +222,7 @@
             <w:tcW w:w="1958" w:type="dxa"/>
           </w:tcPr>
           <w:p>
-            <w:pPr>
-              <w:rPr>
-                <w:lang w:val="en-JE"/>
-              </w:rPr>
-            </w:pPr>
-            <w:r>
-              <w:rPr>
-                <w:lang w:val="en-JE"/>
-              </w:rPr>
+            <w:r>
               <w:t>Commit Description</w:t>
             </w:r>
           </w:p>
@@ -560,15 +232,7 @@
             <w:tcW w:w="1820" w:type="dxa"/>
           </w:tcPr>
           <w:p>
-            <w:pPr>
-              <w:rPr>
-                <w:lang w:val="en-JE"/>
-              </w:rPr>
-            </w:pPr>
-            <w:r>
-              <w:rPr>
-                <w:lang w:val="en-JE"/>
-              </w:rPr>
+            <w:r>
               <w:t>Driver</w:t>
             </w:r>
           </w:p>
@@ -578,15 +242,7 @@
             <w:tcW w:w="1663" w:type="dxa"/>
           </w:tcPr>
           <w:p>
-            <w:pPr>
-              <w:rPr>
-                <w:lang w:val="en-JE"/>
-              </w:rPr>
-            </w:pPr>
-            <w:r>
-              <w:rPr>
-                <w:lang w:val="en-JE"/>
-              </w:rPr>
+            <w:r>
               <w:t>Navigator</w:t>
             </w:r>
           </w:p>
@@ -598,15 +254,7 @@
             <w:tcW w:w="1785" w:type="dxa"/>
           </w:tcPr>
           <w:p>
-            <w:pPr>
-              <w:rPr>
-                <w:lang w:val="en-JE"/>
-              </w:rPr>
-            </w:pPr>
-            <w:r>
-              <w:rPr>
-                <w:lang w:val="en-JE"/>
-              </w:rPr>
+            <w:r>
               <w:t>October 13th</w:t>
             </w:r>
           </w:p>
@@ -616,15 +264,7 @@
             <w:tcW w:w="1790" w:type="dxa"/>
           </w:tcPr>
           <w:p>
-            <w:pPr>
-              <w:rPr>
-                <w:lang w:val="en-JE"/>
-              </w:rPr>
-            </w:pPr>
-            <w:r>
-              <w:rPr>
-                <w:lang w:val="en-JE"/>
-              </w:rPr>
+            <w:r>
               <w:t>15:00</w:t>
             </w:r>
           </w:p>
@@ -634,21 +274,10 @@
             <w:tcW w:w="1958" w:type="dxa"/>
           </w:tcPr>
           <w:p>
-            <w:pPr>
-              <w:rPr>
-                <w:lang w:val="en-JE"/>
-              </w:rPr>
-            </w:pPr>
-            <w:r>
-              <w:rPr>
-                <w:lang w:val="en-JE"/>
-              </w:rPr>
+            <w:r>
               <w:t>Initial file structure and class setup</w:t>
             </w:r>
             <w:r>
-              <w:rPr>
-                <w:lang w:val="en-JE"/>
-              </w:rPr>
               <w:t>. Maven tests functioning.</w:t>
             </w:r>
           </w:p>
@@ -658,15 +287,7 @@
             <w:tcW w:w="1820" w:type="dxa"/>
           </w:tcPr>
           <w:p>
-            <w:pPr>
-              <w:rPr>
-                <w:lang w:val="en-JE"/>
-              </w:rPr>
-            </w:pPr>
-            <w:r>
-              <w:rPr>
-                <w:lang w:val="en-JE"/>
-              </w:rPr>
+            <w:r>
               <w:t>John</w:t>
             </w:r>
           </w:p>
@@ -676,15 +297,7 @@
             <w:tcW w:w="1663" w:type="dxa"/>
           </w:tcPr>
           <w:p>
-            <w:pPr>
-              <w:rPr>
-                <w:lang w:val="en-JE"/>
-              </w:rPr>
-            </w:pPr>
-            <w:r>
-              <w:rPr>
-                <w:lang w:val="en-JE"/>
-              </w:rPr>
+            <w:r>
               <w:t>Russell</w:t>
             </w:r>
           </w:p>
@@ -696,15 +309,7 @@
             <w:tcW w:w="1785" w:type="dxa"/>
           </w:tcPr>
           <w:p>
-            <w:pPr>
-              <w:rPr>
-                <w:lang w:val="en-JE"/>
-              </w:rPr>
-            </w:pPr>
-            <w:r>
-              <w:rPr>
-                <w:lang w:val="en-JE"/>
-              </w:rPr>
+            <w:r>
               <w:t>October 14th</w:t>
             </w:r>
           </w:p>
@@ -714,15 +319,7 @@
             <w:tcW w:w="1790" w:type="dxa"/>
           </w:tcPr>
           <w:p>
-            <w:pPr>
-              <w:rPr>
-                <w:lang w:val="en-JE"/>
-              </w:rPr>
-            </w:pPr>
-            <w:r>
-              <w:rPr>
-                <w:lang w:val="en-JE"/>
-              </w:rPr>
+            <w:r>
               <w:t>14:25</w:t>
             </w:r>
           </w:p>
@@ -732,15 +329,7 @@
             <w:tcW w:w="1958" w:type="dxa"/>
           </w:tcPr>
           <w:p>
-            <w:pPr>
-              <w:rPr>
-                <w:lang w:val="en-JE"/>
-              </w:rPr>
-            </w:pPr>
-            <w:r>
-              <w:rPr>
-                <w:lang w:val="en-JE"/>
-              </w:rPr>
+            <w:r>
               <w:t>Continue work on multiple classes. Thoughts of extending Deck class with a Pack class which can be used in initialization of game.</w:t>
             </w:r>
           </w:p>
@@ -750,15 +339,7 @@
             <w:tcW w:w="1820" w:type="dxa"/>
           </w:tcPr>
           <w:p>
-            <w:pPr>
-              <w:rPr>
-                <w:lang w:val="en-JE"/>
-              </w:rPr>
-            </w:pPr>
-            <w:r>
-              <w:rPr>
-                <w:lang w:val="en-JE"/>
-              </w:rPr>
+            <w:r>
               <w:t>John</w:t>
             </w:r>
           </w:p>
@@ -768,15 +349,7 @@
             <w:tcW w:w="1663" w:type="dxa"/>
           </w:tcPr>
           <w:p>
-            <w:pPr>
-              <w:rPr>
-                <w:lang w:val="en-JE"/>
-              </w:rPr>
-            </w:pPr>
-            <w:r>
-              <w:rPr>
-                <w:lang w:val="en-JE"/>
-              </w:rPr>
+            <w:r>
               <w:t>Russell</w:t>
             </w:r>
           </w:p>
@@ -788,15 +361,7 @@
             <w:tcW w:w="1785" w:type="dxa"/>
           </w:tcPr>
           <w:p>
-            <w:pPr>
-              <w:rPr>
-                <w:lang w:val="en-JE"/>
-              </w:rPr>
-            </w:pPr>
-            <w:r>
-              <w:rPr>
-                <w:lang w:val="en-JE"/>
-              </w:rPr>
+            <w:r>
               <w:t>October 16th</w:t>
             </w:r>
           </w:p>
@@ -806,15 +371,7 @@
             <w:tcW w:w="1790" w:type="dxa"/>
           </w:tcPr>
           <w:p>
-            <w:pPr>
-              <w:rPr>
-                <w:lang w:val="en-JE"/>
-              </w:rPr>
-            </w:pPr>
-            <w:r>
-              <w:rPr>
-                <w:lang w:val="en-JE"/>
-              </w:rPr>
+            <w:r>
               <w:t>12:15</w:t>
             </w:r>
           </w:p>
@@ -824,15 +381,7 @@
             <w:tcW w:w="1958" w:type="dxa"/>
           </w:tcPr>
           <w:p>
-            <w:pPr>
-              <w:rPr>
-                <w:lang w:val="en-JE"/>
-              </w:rPr>
-            </w:pPr>
-            <w:r>
-              <w:rPr>
-                <w:lang w:val="en-JE"/>
-              </w:rPr>
+            <w:r>
               <w:t>Added key Player logic and finished Deck methods.</w:t>
             </w:r>
           </w:p>
@@ -842,15 +391,7 @@
             <w:tcW w:w="1820" w:type="dxa"/>
           </w:tcPr>
           <w:p>
-            <w:pPr>
-              <w:rPr>
-                <w:lang w:val="en-JE"/>
-              </w:rPr>
-            </w:pPr>
-            <w:r>
-              <w:rPr>
-                <w:lang w:val="en-JE"/>
-              </w:rPr>
+            <w:r>
               <w:t>Russell</w:t>
             </w:r>
           </w:p>
@@ -860,15 +401,7 @@
             <w:tcW w:w="1663" w:type="dxa"/>
           </w:tcPr>
           <w:p>
-            <w:pPr>
-              <w:rPr>
-                <w:lang w:val="en-JE"/>
-              </w:rPr>
-            </w:pPr>
-            <w:r>
-              <w:rPr>
-                <w:lang w:val="en-JE"/>
-              </w:rPr>
+            <w:r>
               <w:t>John</w:t>
             </w:r>
           </w:p>
@@ -880,15 +413,7 @@
             <w:tcW w:w="1785" w:type="dxa"/>
           </w:tcPr>
           <w:p>
-            <w:pPr>
-              <w:rPr>
-                <w:lang w:val="en-JE"/>
-              </w:rPr>
-            </w:pPr>
-            <w:r>
-              <w:rPr>
-                <w:lang w:val="en-JE"/>
-              </w:rPr>
+            <w:r>
               <w:t>October 16th</w:t>
             </w:r>
           </w:p>
@@ -898,15 +423,7 @@
             <w:tcW w:w="1790" w:type="dxa"/>
           </w:tcPr>
           <w:p>
-            <w:pPr>
-              <w:rPr>
-                <w:lang w:val="en-JE"/>
-              </w:rPr>
-            </w:pPr>
-            <w:r>
-              <w:rPr>
-                <w:lang w:val="en-JE"/>
-              </w:rPr>
+            <w:r>
               <w:t>18:00</w:t>
             </w:r>
           </w:p>
@@ -916,15 +433,7 @@
             <w:tcW w:w="1958" w:type="dxa"/>
           </w:tcPr>
           <w:p>
-            <w:pPr>
-              <w:rPr>
-                <w:lang w:val="en-JE"/>
-              </w:rPr>
-            </w:pPr>
-            <w:r>
-              <w:rPr>
-                <w:lang w:val="en-JE"/>
-              </w:rPr>
+            <w:r>
               <w:t>Worked on Hand, Player and Deck interlink and security between classes.</w:t>
             </w:r>
           </w:p>
@@ -934,15 +443,7 @@
             <w:tcW w:w="1820" w:type="dxa"/>
           </w:tcPr>
           <w:p>
-            <w:pPr>
-              <w:rPr>
-                <w:lang w:val="en-JE"/>
-              </w:rPr>
-            </w:pPr>
-            <w:r>
-              <w:rPr>
-                <w:lang w:val="en-JE"/>
-              </w:rPr>
+            <w:r>
               <w:t>John</w:t>
             </w:r>
           </w:p>
@@ -952,15 +453,7 @@
             <w:tcW w:w="1663" w:type="dxa"/>
           </w:tcPr>
           <w:p>
-            <w:pPr>
-              <w:rPr>
-                <w:lang w:val="en-JE"/>
-              </w:rPr>
-            </w:pPr>
-            <w:r>
-              <w:rPr>
-                <w:lang w:val="en-JE"/>
-              </w:rPr>
+            <w:r>
               <w:t>Russell</w:t>
             </w:r>
           </w:p>
@@ -972,15 +465,7 @@
             <w:tcW w:w="1785" w:type="dxa"/>
           </w:tcPr>
           <w:p>
-            <w:pPr>
-              <w:rPr>
-                <w:lang w:val="en-JE"/>
-              </w:rPr>
-            </w:pPr>
-            <w:r>
-              <w:rPr>
-                <w:lang w:val="en-JE"/>
-              </w:rPr>
+            <w:r>
               <w:t>October 18th</w:t>
             </w:r>
           </w:p>
@@ -990,15 +475,7 @@
             <w:tcW w:w="1790" w:type="dxa"/>
           </w:tcPr>
           <w:p>
-            <w:pPr>
-              <w:rPr>
-                <w:lang w:val="en-JE"/>
-              </w:rPr>
-            </w:pPr>
-            <w:r>
-              <w:rPr>
-                <w:lang w:val="en-JE"/>
-              </w:rPr>
+            <w:r>
               <w:t>18:13</w:t>
             </w:r>
           </w:p>
@@ -1008,21 +485,10 @@
             <w:tcW w:w="1958" w:type="dxa"/>
           </w:tcPr>
           <w:p>
-            <w:pPr>
-              <w:rPr>
-                <w:lang w:val="en-JE"/>
-              </w:rPr>
-            </w:pPr>
-            <w:r>
-              <w:rPr>
-                <w:lang w:val="en-JE"/>
-              </w:rPr>
+            <w:r>
               <w:t xml:space="preserve">Added randomness to Hand, </w:t>
             </w:r>
             <w:r>
-              <w:rPr>
-                <w:lang w:val="en-JE"/>
-              </w:rPr>
               <w:t>add file logging and finished methods.</w:t>
             </w:r>
           </w:p>
@@ -1032,15 +498,7 @@
             <w:tcW w:w="1820" w:type="dxa"/>
           </w:tcPr>
           <w:p>
-            <w:pPr>
-              <w:rPr>
-                <w:lang w:val="en-JE"/>
-              </w:rPr>
-            </w:pPr>
-            <w:r>
-              <w:rPr>
-                <w:lang w:val="en-JE"/>
-              </w:rPr>
+            <w:r>
               <w:t>Russell</w:t>
             </w:r>
           </w:p>
@@ -1050,15 +508,7 @@
             <w:tcW w:w="1663" w:type="dxa"/>
           </w:tcPr>
           <w:p>
-            <w:pPr>
-              <w:rPr>
-                <w:lang w:val="en-JE"/>
-              </w:rPr>
-            </w:pPr>
-            <w:r>
-              <w:rPr>
-                <w:lang w:val="en-JE"/>
-              </w:rPr>
+            <w:r>
               <w:t>John</w:t>
             </w:r>
           </w:p>
@@ -1070,15 +520,7 @@
             <w:tcW w:w="1785" w:type="dxa"/>
           </w:tcPr>
           <w:p>
-            <w:pPr>
-              <w:rPr>
-                <w:lang w:val="en-JE"/>
-              </w:rPr>
-            </w:pPr>
-            <w:r>
-              <w:rPr>
-                <w:lang w:val="en-JE"/>
-              </w:rPr>
+            <w:r>
               <w:t>October 18th</w:t>
             </w:r>
           </w:p>
@@ -1088,15 +530,7 @@
             <w:tcW w:w="1790" w:type="dxa"/>
           </w:tcPr>
           <w:p>
-            <w:pPr>
-              <w:rPr>
-                <w:lang w:val="en-JE"/>
-              </w:rPr>
-            </w:pPr>
-            <w:r>
-              <w:rPr>
-                <w:lang w:val="en-JE"/>
-              </w:rPr>
+            <w:r>
               <w:t>23:16</w:t>
             </w:r>
           </w:p>
@@ -1106,21 +540,10 @@
             <w:tcW w:w="1958" w:type="dxa"/>
           </w:tcPr>
           <w:p>
-            <w:pPr>
-              <w:rPr>
-                <w:lang w:val="en-JE"/>
-              </w:rPr>
-            </w:pPr>
-            <w:r>
-              <w:rPr>
-                <w:lang w:val="en-JE"/>
-              </w:rPr>
+            <w:r>
               <w:t xml:space="preserve">Found syntax errors, missing functions and </w:t>
             </w:r>
             <w:r>
-              <w:rPr>
-                <w:lang w:val="en-JE"/>
-              </w:rPr>
               <w:t>comment formatting.</w:t>
             </w:r>
           </w:p>
@@ -1130,15 +553,7 @@
             <w:tcW w:w="1820" w:type="dxa"/>
           </w:tcPr>
           <w:p>
-            <w:pPr>
-              <w:rPr>
-                <w:lang w:val="en-JE"/>
-              </w:rPr>
-            </w:pPr>
-            <w:r>
-              <w:rPr>
-                <w:lang w:val="en-JE"/>
-              </w:rPr>
+            <w:r>
               <w:t>John</w:t>
             </w:r>
           </w:p>
@@ -1148,15 +563,7 @@
             <w:tcW w:w="1663" w:type="dxa"/>
           </w:tcPr>
           <w:p>
-            <w:pPr>
-              <w:rPr>
-                <w:lang w:val="en-JE"/>
-              </w:rPr>
-            </w:pPr>
-            <w:r>
-              <w:rPr>
-                <w:lang w:val="en-JE"/>
-              </w:rPr>
+            <w:r>
               <w:t>Russell</w:t>
             </w:r>
           </w:p>
@@ -1168,15 +575,7 @@
             <w:tcW w:w="1785" w:type="dxa"/>
           </w:tcPr>
           <w:p>
-            <w:pPr>
-              <w:rPr>
-                <w:lang w:val="en-JE"/>
-              </w:rPr>
-            </w:pPr>
-            <w:r>
-              <w:rPr>
-                <w:lang w:val="en-JE"/>
-              </w:rPr>
+            <w:r>
               <w:t>October 19th</w:t>
             </w:r>
           </w:p>
@@ -1186,21 +585,10 @@
             <w:tcW w:w="1790" w:type="dxa"/>
           </w:tcPr>
           <w:p>
-            <w:pPr>
-              <w:rPr>
-                <w:lang w:val="en-JE"/>
-              </w:rPr>
-            </w:pPr>
-            <w:r>
-              <w:rPr>
-                <w:lang w:val="en-JE"/>
-              </w:rPr>
+            <w:r>
               <w:t>1</w:t>
             </w:r>
             <w:r>
-              <w:rPr>
-                <w:lang w:val="en-JE"/>
-              </w:rPr>
               <w:t>1:26</w:t>
             </w:r>
           </w:p>
@@ -1210,15 +598,7 @@
             <w:tcW w:w="1958" w:type="dxa"/>
           </w:tcPr>
           <w:p>
-            <w:pPr>
-              <w:rPr>
-                <w:lang w:val="en-JE"/>
-              </w:rPr>
-            </w:pPr>
-            <w:r>
-              <w:rPr>
-                <w:lang w:val="en-JE"/>
-              </w:rPr>
+            <w:r>
               <w:t>Add start game method and user input requests.</w:t>
             </w:r>
           </w:p>
@@ -1228,15 +608,7 @@
             <w:tcW w:w="1820" w:type="dxa"/>
           </w:tcPr>
           <w:p>
-            <w:pPr>
-              <w:rPr>
-                <w:lang w:val="en-JE"/>
-              </w:rPr>
-            </w:pPr>
-            <w:r>
-              <w:rPr>
-                <w:lang w:val="en-JE"/>
-              </w:rPr>
+            <w:r>
               <w:t>Russell</w:t>
             </w:r>
           </w:p>
@@ -1246,15 +618,7 @@
             <w:tcW w:w="1663" w:type="dxa"/>
           </w:tcPr>
           <w:p>
-            <w:pPr>
-              <w:rPr>
-                <w:lang w:val="en-JE"/>
-              </w:rPr>
-            </w:pPr>
-            <w:r>
-              <w:rPr>
-                <w:lang w:val="en-JE"/>
-              </w:rPr>
+            <w:r>
               <w:t>John</w:t>
             </w:r>
           </w:p>
@@ -1266,15 +630,7 @@
             <w:tcW w:w="1785" w:type="dxa"/>
           </w:tcPr>
           <w:p>
-            <w:pPr>
-              <w:rPr>
-                <w:lang w:val="en-JE"/>
-              </w:rPr>
-            </w:pPr>
-            <w:r>
-              <w:rPr>
-                <w:lang w:val="en-JE"/>
-              </w:rPr>
+            <w:r>
               <w:t>October 19th</w:t>
             </w:r>
           </w:p>
@@ -1284,15 +640,7 @@
             <w:tcW w:w="1790" w:type="dxa"/>
           </w:tcPr>
           <w:p>
-            <w:pPr>
-              <w:rPr>
-                <w:lang w:val="en-JE"/>
-              </w:rPr>
-            </w:pPr>
-            <w:r>
-              <w:rPr>
-                <w:lang w:val="en-JE"/>
-              </w:rPr>
+            <w:r>
               <w:t>23:49</w:t>
             </w:r>
           </w:p>
@@ -1302,35 +650,10 @@
             <w:tcW w:w="1958" w:type="dxa"/>
           </w:tcPr>
           <w:p>
-            <w:pPr>
-              <w:rPr>
-                <w:lang w:val="en-JE"/>
-              </w:rPr>
-            </w:pPr>
-            <w:r>
-              <w:rPr>
-                <w:lang w:val="en-JE"/>
-              </w:rPr>
-              <w:t xml:space="preserve">Completed </w:t>
-            </w:r>
-            <w:proofErr w:type="spellStart"/>
-            <w:r>
-              <w:rPr>
-                <w:lang w:val="en-JE"/>
-              </w:rPr>
-              <w:t>CardGame</w:t>
-            </w:r>
-            <w:proofErr w:type="spellEnd"/>
-            <w:r>
-              <w:rPr>
-                <w:lang w:val="en-JE"/>
-              </w:rPr>
-              <w:t>, created exceptions</w:t>
-            </w:r>
-            <w:r>
-              <w:rPr>
-                <w:lang w:val="en-JE"/>
-              </w:rPr>
+            <w:r>
+              <w:t>Completed CardGame, created exceptions</w:t>
+            </w:r>
+            <w:r>
               <w:t>, nearly at testing stage.</w:t>
             </w:r>
           </w:p>
@@ -1340,15 +663,7 @@
             <w:tcW w:w="1820" w:type="dxa"/>
           </w:tcPr>
           <w:p>
-            <w:pPr>
-              <w:rPr>
-                <w:lang w:val="en-JE"/>
-              </w:rPr>
-            </w:pPr>
-            <w:r>
-              <w:rPr>
-                <w:lang w:val="en-JE"/>
-              </w:rPr>
+            <w:r>
               <w:t>John</w:t>
             </w:r>
           </w:p>
@@ -1358,15 +673,7 @@
             <w:tcW w:w="1663" w:type="dxa"/>
           </w:tcPr>
           <w:p>
-            <w:pPr>
-              <w:rPr>
-                <w:lang w:val="en-JE"/>
-              </w:rPr>
-            </w:pPr>
-            <w:r>
-              <w:rPr>
-                <w:lang w:val="en-JE"/>
-              </w:rPr>
+            <w:r>
               <w:t>Russell</w:t>
             </w:r>
           </w:p>
@@ -1378,15 +685,7 @@
             <w:tcW w:w="1785" w:type="dxa"/>
           </w:tcPr>
           <w:p>
-            <w:pPr>
-              <w:rPr>
-                <w:lang w:val="en-JE"/>
-              </w:rPr>
-            </w:pPr>
-            <w:r>
-              <w:rPr>
-                <w:lang w:val="en-JE"/>
-              </w:rPr>
+            <w:r>
               <w:t>October 20th</w:t>
             </w:r>
           </w:p>
@@ -1396,15 +695,7 @@
             <w:tcW w:w="1790" w:type="dxa"/>
           </w:tcPr>
           <w:p>
-            <w:pPr>
-              <w:rPr>
-                <w:lang w:val="en-JE"/>
-              </w:rPr>
-            </w:pPr>
-            <w:r>
-              <w:rPr>
-                <w:lang w:val="en-JE"/>
-              </w:rPr>
+            <w:r>
               <w:t>00:53</w:t>
             </w:r>
           </w:p>
@@ -1414,15 +705,7 @@
             <w:tcW w:w="1958" w:type="dxa"/>
           </w:tcPr>
           <w:p>
-            <w:pPr>
-              <w:rPr>
-                <w:lang w:val="en-JE"/>
-              </w:rPr>
-            </w:pPr>
-            <w:r>
-              <w:rPr>
-                <w:lang w:val="en-JE"/>
-              </w:rPr>
+            <w:r>
               <w:t>Fixed bugs, fixed deadlock, ran tests on classes.</w:t>
             </w:r>
           </w:p>
@@ -1432,15 +715,7 @@
             <w:tcW w:w="1820" w:type="dxa"/>
           </w:tcPr>
           <w:p>
-            <w:pPr>
-              <w:rPr>
-                <w:lang w:val="en-JE"/>
-              </w:rPr>
-            </w:pPr>
-            <w:r>
-              <w:rPr>
-                <w:lang w:val="en-JE"/>
-              </w:rPr>
+            <w:r>
               <w:t>John</w:t>
             </w:r>
           </w:p>
@@ -1450,29 +725,136 @@
             <w:tcW w:w="1663" w:type="dxa"/>
           </w:tcPr>
           <w:p>
-            <w:pPr>
-              <w:rPr>
-                <w:lang w:val="en-JE"/>
-              </w:rPr>
-            </w:pPr>
-            <w:r>
-              <w:rPr>
-                <w:lang w:val="en-JE"/>
-              </w:rPr>
+            <w:r>
               <w:t>Russell</w:t>
             </w:r>
           </w:p>
         </w:tc>
       </w:tr>
     </w:tbl>
+    <w:p/>
     <w:p>
       <w:pPr>
         <w:rPr>
-          <w:lang w:val="en-JE"/>
+          <w:lang w:val="en-GB"/>
         </w:rPr>
       </w:pPr>
     </w:p>
-    <w:p/>
+    <w:p>
+      <w:pPr>
+        <w:rPr>
+          <w:lang w:val="en-GB"/>
+        </w:rPr>
+      </w:pPr>
+    </w:p>
+    <w:p>
+      <w:pPr>
+        <w:rPr>
+          <w:lang w:val="en-GB"/>
+        </w:rPr>
+      </w:pPr>
+    </w:p>
+    <w:p>
+      <w:pPr>
+        <w:rPr>
+          <w:lang w:val="en-GB"/>
+        </w:rPr>
+      </w:pPr>
+    </w:p>
+    <w:p>
+      <w:pPr>
+        <w:rPr>
+          <w:lang w:val="en-GB"/>
+        </w:rPr>
+      </w:pPr>
+      <w:r>
+        <w:rPr>
+          <w:lang w:val="en-GB"/>
+        </w:rPr>
+        <w:lastRenderedPageBreak/>
+        <w:t>All classes were tested to ensure the discarding / drawing logic followed the strcuture outlined in the sepcification. The pack subclass was also tested to ensure that it loaded the pack file correctly and throws the correct exceptions if something goes wrong. Additionally, the CardGame class was tested with varying amounts of players to get a better idea about its efficiency. The results were plotted using pyplot:</w:t>
+      </w:r>
+    </w:p>
+    <w:p>
+      <w:pPr>
+        <w:rPr>
+          <w:lang w:val="en-GB"/>
+        </w:rPr>
+      </w:pPr>
+      <w:r>
+        <w:rPr>
+          <w:lang w:val="en-GB"/>
+        </w:rPr>
+        <w:br/>
+      </w:r>
+      <w:r>
+        <w:rPr>
+          <w:noProof/>
+          <w:lang w:val="en-GB"/>
+        </w:rPr>
+        <w:drawing>
+          <wp:inline distT="0" distB="0" distL="0" distR="0" wp14:anchorId="4DF5313E" wp14:editId="0BFFBBB1">
+            <wp:extent cx="5731510" cy="4119245"/>
+            <wp:effectExtent l="0" t="0" r="2540" b="0"/>
+            <wp:docPr id="2099136194" name="Picture 2"/>
+            <wp:cNvGraphicFramePr>
+              <a:graphicFrameLocks xmlns:a="http://schemas.openxmlformats.org/drawingml/2006/main" noChangeAspect="1"/>
+            </wp:cNvGraphicFramePr>
+            <a:graphic xmlns:a="http://schemas.openxmlformats.org/drawingml/2006/main">
+              <a:graphicData uri="http://schemas.openxmlformats.org/drawingml/2006/picture">
+                <pic:pic xmlns:pic="http://schemas.openxmlformats.org/drawingml/2006/picture">
+                  <pic:nvPicPr>
+                    <pic:cNvPr id="2099136194" name="Picture 2099136194"/>
+                    <pic:cNvPicPr/>
+                  </pic:nvPicPr>
+                  <pic:blipFill>
+                    <a:blip r:embed="rId4">
+                      <a:extLst>
+                        <a:ext uri="{28A0092B-C50C-407E-A947-70E740481C1C}">
+                          <a14:useLocalDpi xmlns:a14="http://schemas.microsoft.com/office/drawing/2010/main" val="0"/>
+                        </a:ext>
+                      </a:extLst>
+                    </a:blip>
+                    <a:stretch>
+                      <a:fillRect/>
+                    </a:stretch>
+                  </pic:blipFill>
+                  <pic:spPr>
+                    <a:xfrm>
+                      <a:off x="0" y="0"/>
+                      <a:ext cx="5731510" cy="4119245"/>
+                    </a:xfrm>
+                    <a:prstGeom prst="rect">
+                      <a:avLst/>
+                    </a:prstGeom>
+                  </pic:spPr>
+                </pic:pic>
+              </a:graphicData>
+            </a:graphic>
+          </wp:inline>
+        </w:drawing>
+      </w:r>
+    </w:p>
+    <w:p>
+      <w:pPr>
+        <w:rPr>
+          <w:lang w:val="en-GB"/>
+        </w:rPr>
+      </w:pPr>
+    </w:p>
+    <w:p>
+      <w:pPr>
+        <w:rPr>
+          <w:lang w:val="en-GB"/>
+        </w:rPr>
+      </w:pPr>
+      <w:r>
+        <w:rPr>
+          <w:lang w:val="en-GB"/>
+        </w:rPr>
+        <w:t>The graph shows that the program executes in O(n) where n is the number of players. It appears that the variance in runtime increases rapidly beyond n=30, however stays fairly consistent below this threshold.</w:t>
+      </w:r>
+    </w:p>
     <w:sectPr>
       <w:pgSz w:w="11906" w:h="16838"/>
       <w:pgMar w:top="1440" w:right="1440" w:bottom="1440" w:left="1440" w:header="708" w:footer="708" w:gutter="0"/>
@@ -1492,7 +874,7 @@
         <w:kern w:val="2"/>
         <w:sz w:val="22"/>
         <w:szCs w:val="22"/>
-        <w:lang w:val="en-JE" w:eastAsia="en-US" w:bidi="ar-SA"/>
+        <w:lang w:eastAsia="en-US" w:bidi="ar-SA"/>
         <w14:ligatures w14:val="standardContextual"/>
       </w:rPr>
     </w:rPrDefault>
@@ -2086,6 +1468,7 @@
   <w:style w:type="character" w:default="1" w:styleId="DefaultParagraphFont">
     <w:name w:val="Default Paragraph Font"/>
     <w:uiPriority w:val="1"/>
+    <w:semiHidden/>
     <w:unhideWhenUsed/>
   </w:style>
   <w:style w:type="table" w:default="1" w:styleId="TableNormal">

</xml_diff>

<commit_message>
Minor change to word doc.
</commit_message>
<xml_diff>
--- a/CardGame Documentation.docx
+++ b/CardGame Documentation.docx
@@ -733,64 +733,29 @@
       </w:tr>
     </w:tbl>
     <w:p/>
-    <w:p>
-      <w:pPr>
-        <w:rPr>
-          <w:lang w:val="en-GB"/>
-        </w:rPr>
-      </w:pPr>
-    </w:p>
-    <w:p>
-      <w:pPr>
-        <w:rPr>
-          <w:lang w:val="en-GB"/>
-        </w:rPr>
-      </w:pPr>
-    </w:p>
-    <w:p>
-      <w:pPr>
-        <w:rPr>
-          <w:lang w:val="en-GB"/>
-        </w:rPr>
-      </w:pPr>
-    </w:p>
-    <w:p>
-      <w:pPr>
-        <w:rPr>
-          <w:lang w:val="en-GB"/>
-        </w:rPr>
-      </w:pPr>
-    </w:p>
-    <w:p>
-      <w:pPr>
-        <w:rPr>
-          <w:lang w:val="en-GB"/>
-        </w:rPr>
-      </w:pPr>
-      <w:r>
-        <w:rPr>
-          <w:lang w:val="en-GB"/>
-        </w:rPr>
+    <w:p/>
+    <w:p/>
+    <w:p/>
+    <w:p/>
+    <w:p>
+      <w:r>
         <w:lastRenderedPageBreak/>
-        <w:t>All classes were tested to ensure the discarding / drawing logic followed the strcuture outlined in the sepcification. The pack subclass was also tested to ensure that it loaded the pack file correctly and throws the correct exceptions if something goes wrong. Additionally, the CardGame class was tested with varying amounts of players to get a better idea about its efficiency. The results were plotted using pyplot:</w:t>
-      </w:r>
-    </w:p>
-    <w:p>
-      <w:pPr>
-        <w:rPr>
-          <w:lang w:val="en-GB"/>
-        </w:rPr>
-      </w:pPr>
-      <w:r>
-        <w:rPr>
-          <w:lang w:val="en-GB"/>
-        </w:rPr>
+        <w:t>All classes were tested</w:t>
+      </w:r>
+      <w:r>
+        <w:t xml:space="preserve"> with Junit 5 / Maven</w:t>
+      </w:r>
+      <w:r>
+        <w:t xml:space="preserve"> to ensure the discarding / drawing logic followed the strcuture outlined in the sepcification. The pack subclass was also tested to ensure that it loaded the pack file correctly and throws the correct exceptions if something goes wrong. Additionally, the CardGame class was tested with varying amounts of players to get a better idea about its efficiency. The results were plotted using pyplot:</w:t>
+      </w:r>
+    </w:p>
+    <w:p>
+      <w:r>
         <w:br/>
       </w:r>
       <w:r>
         <w:rPr>
           <w:noProof/>
-          <w:lang w:val="en-GB"/>
         </w:rPr>
         <w:drawing>
           <wp:inline distT="0" distB="0" distL="0" distR="0" wp14:anchorId="4DF5313E" wp14:editId="0BFFBBB1">
@@ -835,23 +800,9 @@
         </w:drawing>
       </w:r>
     </w:p>
-    <w:p>
-      <w:pPr>
-        <w:rPr>
-          <w:lang w:val="en-GB"/>
-        </w:rPr>
-      </w:pPr>
-    </w:p>
-    <w:p>
-      <w:pPr>
-        <w:rPr>
-          <w:lang w:val="en-GB"/>
-        </w:rPr>
-      </w:pPr>
-      <w:r>
-        <w:rPr>
-          <w:lang w:val="en-GB"/>
-        </w:rPr>
+    <w:p/>
+    <w:p>
+      <w:r>
         <w:t>The graph shows that the program executes in O(n) where n is the number of players. It appears that the variance in runtime increases rapidly beyond n=30, however stays fairly consistent below this threshold.</w:t>
       </w:r>
     </w:p>
@@ -874,7 +825,7 @@
         <w:kern w:val="2"/>
         <w:sz w:val="22"/>
         <w:szCs w:val="22"/>
-        <w:lang w:eastAsia="en-US" w:bidi="ar-SA"/>
+        <w:lang w:val="en-GB" w:eastAsia="en-US" w:bidi="ar-SA"/>
         <w14:ligatures w14:val="standardContextual"/>
       </w:rPr>
     </w:rPrDefault>

</xml_diff>

<commit_message>
Added more info on testing to word doc.
</commit_message>
<xml_diff>
--- a/CardGame Documentation.docx
+++ b/CardGame Documentation.docx
@@ -804,6 +804,11 @@
     <w:p>
       <w:r>
         <w:t>The graph shows that the program executes in O(n) where n is the number of players. It appears that the variance in runtime increases rapidly beyond n=30, however stays fairly consistent below this threshold.</w:t>
+      </w:r>
+    </w:p>
+    <w:p>
+      <w:r>
+        <w:t>Testing revealed somelogical errors, such as draw and discard being the wrong way round in player’s atomicDrawDiscard. This caused players to occasionally discard cards that they had picked up during the atomic action, which goes against the atomic principle. This was resolved by switching the actions round.</w:t>
       </w:r>
     </w:p>
     <w:sectPr>

</xml_diff>